<commit_message>
Update resume files from Google Docs
</commit_message>
<xml_diff>
--- a/public/resume/Carlos_F_Revilla-Resume.docx
+++ b/public/resume/Carlos_F_Revilla-Resume.docx
@@ -17,31 +17,40 @@
       <w:r>
         <w:rPr>
           <w:rFonts w:ascii="Times New Roman" w:cs="Times New Roman" w:eastAsia="Times New Roman" w:hAnsi="Times New Roman"/>
+          <w:sz w:val="48"/>
+          <w:szCs w:val="48"/>
+          <w:rtl w:val="0"/>
+        </w:rPr>
+        <w:t xml:space="preserve">Carlos Fernando</w:t>
+      </w:r>
+      <w:r>
+        <w:rPr>
+          <w:rFonts w:ascii="Times New Roman" w:cs="Times New Roman" w:eastAsia="Times New Roman" w:hAnsi="Times New Roman"/>
+          <w:b w:val="1"/>
+          <w:bCs w:val="1"/>
+          <w:sz w:val="48"/>
+          <w:szCs w:val="48"/>
+          <w:rtl w:val="0"/>
+        </w:rPr>
+        <w:t xml:space="preserve"> </w:t>
+      </w:r>
+      <w:r>
+        <w:rPr>
+          <w:rFonts w:ascii="Times New Roman" w:cs="Times New Roman" w:eastAsia="Times New Roman" w:hAnsi="Times New Roman"/>
+          <w:sz w:val="48"/>
+          <w:szCs w:val="48"/>
+          <w:rtl w:val="0"/>
+        </w:rPr>
+        <w:t xml:space="preserve">Revilla</w:t>
+      </w:r>
+      <w:r>
+        <w:rPr>
+          <w:rFonts w:ascii="Times New Roman" w:cs="Times New Roman" w:eastAsia="Times New Roman" w:hAnsi="Times New Roman"/>
           <w:sz w:val="52"/>
           <w:szCs w:val="52"/>
           <w:rtl w:val="0"/>
         </w:rPr>
-        <w:t xml:space="preserve">Carlos Fernando</w:t>
-      </w:r>
-      <w:r>
-        <w:rPr>
-          <w:rFonts w:ascii="Times New Roman" w:cs="Times New Roman" w:eastAsia="Times New Roman" w:hAnsi="Times New Roman"/>
-          <w:b w:val="1"/>
-          <w:bCs w:val="1"/>
-          <w:sz w:val="52"/>
-          <w:szCs w:val="52"/>
-          <w:rtl w:val="0"/>
-        </w:rPr>
         <w:t xml:space="preserve"> </w:t>
-      </w:r>
-      <w:r>
-        <w:rPr>
-          <w:rFonts w:ascii="Times New Roman" w:cs="Times New Roman" w:eastAsia="Times New Roman" w:hAnsi="Times New Roman"/>
-          <w:sz w:val="52"/>
-          <w:szCs w:val="52"/>
-          <w:rtl w:val="0"/>
-        </w:rPr>
-        <w:t xml:space="preserve">Revilla </w:t>
       </w:r>
       <w:r>
         <w:rPr>
@@ -235,7 +244,7 @@
           <w:szCs w:val="24"/>
           <w:rtl w:val="0"/>
         </w:rPr>
-        <w:t xml:space="preserve">Python, TypeScript, JavaScript, C# (.NET), Java, C++, SQL, SAS, R</w:t>
+        <w:t xml:space="preserve">Python, C# (.NET), JavaScript, TypeScript, Java, C++, C, SQL</w:t>
       </w:r>
     </w:p>
     <w:p>
@@ -270,7 +279,7 @@
           <w:szCs w:val="24"/>
           <w:rtl w:val="0"/>
         </w:rPr>
-        <w:t xml:space="preserve">: AWS,  Terraform, Docker, CI/CD, Apache Kafka &amp; Spark, PostgreSQL, MongoDB, Solr, ETL/ELT Pipelines, TensorFlow, LLM Integration, Git, Jest</w:t>
+        <w:t xml:space="preserve">: AWS, Terraform, Docker, CI/CD, Quartz.NET, .NET MVC, Apache Kafka &amp; Spark, PostgreSQL, MongoDB, Solr, ETL/ELT Pipelines, TensorFlow, LLM Integration, Git, Jest</w:t>
       </w:r>
     </w:p>
     <w:p>
@@ -316,7 +325,7 @@
           <w:tab w:val="left" w:leader="none" w:pos="-1440"/>
           <w:tab w:val="right" w:leader="none" w:pos="10800"/>
         </w:tabs>
-        <w:spacing w:before="23" w:line="240" w:lineRule="auto"/>
+        <w:spacing w:before="20" w:line="240" w:lineRule="auto"/>
         <w:ind w:left="-720" w:right="-450" w:firstLine="0"/>
         <w:rPr>
           <w:rFonts w:ascii="Times New Roman" w:cs="Times New Roman" w:eastAsia="Times New Roman" w:hAnsi="Times New Roman"/>
@@ -370,7 +379,7 @@
           <w:szCs w:val="24"/>
           <w:rtl w:val="0"/>
         </w:rPr>
-        <w:t xml:space="preserve">Architected a multi-service cloud platform on AWS ECS Fargate, using Terraform to provision API Gateway, ALB routing, and per-tenant state isolation, creating a scalable backbone capable of serving AI/ML model endpoints.</w:t>
+        <w:t xml:space="preserve">Enabled on-demand replication of a 20-service AWS architecture across regions and environments by designing a Terraform-based per-tenant isolation pattern for 5 services, then migrating and scaling it to AWS CloudFormation.</w:t>
       </w:r>
     </w:p>
     <w:p>
@@ -398,7 +407,7 @@
           <w:szCs w:val="24"/>
           <w:rtl w:val="0"/>
         </w:rPr>
-        <w:t xml:space="preserve">Designed a fully automated CI/CD pipeline with GitHub Actions and OIDC-based AWS authentication, orchestrating Docker builds and zero-downtime deployments for multiple services.</w:t>
+        <w:t xml:space="preserve">Automated multi-service deployments with GitHub Actions and Docker, using OIDC-based AWS authentication to support zero-downtime releases.</w:t>
       </w:r>
     </w:p>
     <w:p>
@@ -426,7 +435,7 @@
           <w:szCs w:val="24"/>
           <w:rtl w:val="0"/>
         </w:rPr>
-        <w:t xml:space="preserve">Supported in maintenance, and deployments of Quartz.NET background service to preserve data quality for a client-facing dashboard synced with a Citus/RDS that aggregates patient device data.</w:t>
+        <w:t xml:space="preserve">Delivered resilient, dynamically-scheduled data aggregation for patient monitoring utilization data, with automatic recovery from failed jobs via built-in retry logic, by building a multi-tenant background processing service in C#/.NET 8 with Quartz.NET cron-based scheduling synchronized from PostgreSQL, aggregating data across AWS RDS and Citus.</w:t>
       </w:r>
     </w:p>
     <w:p>
@@ -439,7 +448,7 @@
           <w:tab w:val="left" w:leader="none" w:pos="-450"/>
           <w:tab w:val="right" w:leader="none" w:pos="10503"/>
         </w:tabs>
-        <w:spacing w:line="240" w:lineRule="auto"/>
+        <w:spacing w:after="20" w:line="240" w:lineRule="auto"/>
         <w:ind w:left="-270" w:right="-450" w:hanging="360"/>
         <w:rPr>
           <w:rFonts w:ascii="Times New Roman" w:cs="Times New Roman" w:eastAsia="Times New Roman" w:hAnsi="Times New Roman"/>
@@ -454,7 +463,7 @@
           <w:szCs w:val="24"/>
           <w:rtl w:val="0"/>
         </w:rPr>
-        <w:t xml:space="preserve">Maintain and enhance an internal React/</w:t>
+        <w:t xml:space="preserve">Enhanced an internal React/</w:t>
       </w:r>
       <w:r>
         <w:rPr>
@@ -472,37 +481,42 @@
           <w:szCs w:val="24"/>
           <w:rtl w:val="0"/>
         </w:rPr>
-        <w:t xml:space="preserve"> dashboard used by clients to monitor real-time product data streams, leveraging modern AI-assisted development tools to accelerate feature delivery.</w:t>
-      </w:r>
-    </w:p>
-    <w:p>
-      <w:pPr>
-        <w:tabs>
-          <w:tab w:val="left" w:leader="none" w:pos="-450"/>
-          <w:tab w:val="right" w:leader="none" w:pos="10503"/>
+        <w:t xml:space="preserve"> dashboard for monitoring real-time product data streams, using AI-assisted development tools to accelerate feature delivery.</w:t>
+      </w:r>
+    </w:p>
+    <w:p>
+      <w:pPr>
+        <w:tabs>
+          <w:tab w:val="left" w:leader="none" w:pos="-1440"/>
+          <w:tab w:val="right" w:leader="none" w:pos="10800"/>
         </w:tabs>
         <w:spacing w:before="20" w:line="240" w:lineRule="auto"/>
         <w:ind w:left="-720" w:right="-450" w:firstLine="0"/>
         <w:rPr>
           <w:rFonts w:ascii="Times New Roman" w:cs="Times New Roman" w:eastAsia="Times New Roman" w:hAnsi="Times New Roman"/>
-          <w:b w:val="1"/>
-          <w:bCs w:val="1"/>
-          <w:sz w:val="24"/>
-          <w:szCs w:val="24"/>
-        </w:rPr>
-      </w:pPr>
-      <w:r>
-        <w:rPr>
-          <w:rFonts w:ascii="Times New Roman" w:cs="Times New Roman" w:eastAsia="Times New Roman" w:hAnsi="Times New Roman"/>
-          <w:b w:val="1"/>
-          <w:bCs w:val="1"/>
-          <w:sz w:val="24"/>
-          <w:szCs w:val="24"/>
-          <w:rtl w:val="0"/>
-        </w:rPr>
-        <w:t xml:space="preserve">Meta | Data Labeling Analyst (Contract) </w:t>
+          <w:i w:val="1"/>
+          <w:iCs w:val="1"/>
+          <w:sz w:val="24"/>
+          <w:szCs w:val="24"/>
+        </w:rPr>
+      </w:pPr>
+      <w:r>
+        <w:rPr>
+          <w:rFonts w:ascii="Times New Roman" w:cs="Times New Roman" w:eastAsia="Times New Roman" w:hAnsi="Times New Roman"/>
+          <w:b w:val="1"/>
+          <w:bCs w:val="1"/>
+          <w:sz w:val="24"/>
+          <w:szCs w:val="24"/>
+          <w:rtl w:val="0"/>
+        </w:rPr>
+        <w:t xml:space="preserve">Silverchair | Full-Stack Software Engineer</w:t>
         <w:tab/>
-        <w:t xml:space="preserve">Remote | November 2025 – January 2026 </w:t>
+        <w:t xml:space="preserve">Charlottesville, VA | May 2024 - February 2025</w:t>
+      </w:r>
+      <w:r>
+        <w:rPr>
+          <w:rtl w:val="0"/>
+        </w:rPr>
       </w:r>
     </w:p>
     <w:p>
@@ -530,7 +544,7 @@
           <w:szCs w:val="24"/>
           <w:rtl w:val="0"/>
         </w:rPr>
-        <w:t xml:space="preserve">Annotated &amp; Evaluated high-volume text datasets to train and optimize Meta generative machine learning models providing critical ground-truth data to improve algorithmic performance.</w:t>
+        <w:t xml:space="preserve">Delivered interactive learning features including quizzes, study modules, and interactive diagrams for a client-facing medical-education platform, by developing new functionality within a .NET MVC architecture serving textbook content to medical students.</w:t>
       </w:r>
     </w:p>
     <w:p>
@@ -558,7 +572,7 @@
           <w:szCs w:val="24"/>
           <w:rtl w:val="0"/>
         </w:rPr>
-        <w:t xml:space="preserve">Maintained a 98%+ quality assurance score by strictly adhering to complex, rapidly evolving content moderation and data labeling guidelines.</w:t>
+        <w:t xml:space="preserve">Reduced web and mobile search latency by ~300ms and cut database load for textbook search and filtering by title, quiz, author, and ISBN, by eliminating N+1 query bottlenecks in LINQ keeping queries as IQueryable until final projection and tuning mobile middleware functions with caching and batching.</w:t>
       </w:r>
     </w:p>
     <w:p>
@@ -586,42 +600,7 @@
           <w:szCs w:val="24"/>
           <w:rtl w:val="0"/>
         </w:rPr>
-        <w:t xml:space="preserve">Identified data trends and edge cases, collaborating with cross-functional quality control teams to refine labeling schemas and reduce annotation ambiguity.</w:t>
-      </w:r>
-    </w:p>
-    <w:p>
-      <w:pPr>
-        <w:tabs>
-          <w:tab w:val="left" w:leader="none" w:pos="-1440"/>
-          <w:tab w:val="right" w:leader="none" w:pos="10800"/>
-        </w:tabs>
-        <w:spacing w:before="23" w:line="240" w:lineRule="auto"/>
-        <w:ind w:left="-720" w:right="-450" w:firstLine="0"/>
-        <w:rPr>
-          <w:rFonts w:ascii="Times New Roman" w:cs="Times New Roman" w:eastAsia="Times New Roman" w:hAnsi="Times New Roman"/>
-          <w:i w:val="1"/>
-          <w:iCs w:val="1"/>
-          <w:sz w:val="24"/>
-          <w:szCs w:val="24"/>
-        </w:rPr>
-      </w:pPr>
-      <w:r>
-        <w:rPr>
-          <w:rFonts w:ascii="Times New Roman" w:cs="Times New Roman" w:eastAsia="Times New Roman" w:hAnsi="Times New Roman"/>
-          <w:b w:val="1"/>
-          <w:bCs w:val="1"/>
-          <w:sz w:val="24"/>
-          <w:szCs w:val="24"/>
-          <w:rtl w:val="0"/>
-        </w:rPr>
-        <w:t xml:space="preserve">Silverchair | Full-Stack Software Engineer</w:t>
-        <w:tab/>
-        <w:t xml:space="preserve">Charlottesville, VA | May 2024 - February 2025</w:t>
-      </w:r>
-      <w:r>
-        <w:rPr>
-          <w:rtl w:val="0"/>
-        </w:rPr>
+        <w:t xml:space="preserve">Improved content accuracy and reduced user-reported errors by 28% by diagnosing data integrity issues in an Apache Solr pipeline and re-ingesting missing columns.</w:t>
       </w:r>
     </w:p>
     <w:p>
@@ -634,20 +613,120 @@
           <w:tab w:val="left" w:leader="none" w:pos="-450"/>
           <w:tab w:val="right" w:leader="none" w:pos="10503"/>
         </w:tabs>
-        <w:spacing w:line="240" w:lineRule="auto"/>
+        <w:spacing w:after="20" w:line="240" w:lineRule="auto"/>
         <w:ind w:left="-270" w:right="-450" w:hanging="360"/>
         <w:rPr>
-          <w:rFonts w:ascii="Source Sans Pro" w:cs="Source Sans Pro" w:eastAsia="Source Sans Pro" w:hAnsi="Source Sans Pro"/>
-        </w:rPr>
-      </w:pPr>
-      <w:r>
-        <w:rPr>
-          <w:rFonts w:ascii="Times New Roman" w:cs="Times New Roman" w:eastAsia="Times New Roman" w:hAnsi="Times New Roman"/>
-          <w:sz w:val="24"/>
-          <w:szCs w:val="24"/>
-          <w:rtl w:val="0"/>
-        </w:rPr>
-        <w:t xml:space="preserve">Diagnosed and resolved critical data integrity issues in a Solr pipeline by re-ingesting missing columns, restoring content accuracy and eliminating 28% of user-reported errors.</w:t>
+          <w:rFonts w:ascii="Times New Roman" w:cs="Times New Roman" w:eastAsia="Times New Roman" w:hAnsi="Times New Roman"/>
+          <w:sz w:val="24"/>
+          <w:szCs w:val="24"/>
+        </w:rPr>
+      </w:pPr>
+      <w:r>
+        <w:rPr>
+          <w:rFonts w:ascii="Times New Roman" w:cs="Times New Roman" w:eastAsia="Times New Roman" w:hAnsi="Times New Roman"/>
+          <w:sz w:val="24"/>
+          <w:szCs w:val="24"/>
+          <w:rtl w:val="0"/>
+        </w:rPr>
+        <w:t xml:space="preserve">Reduced manual QA efforts by 2 hours per week by building a comprehensive Jest test suite for data-critical features, strengthening JavaScript application reliability.</w:t>
+      </w:r>
+    </w:p>
+    <w:p>
+      <w:pPr>
+        <w:pBdr>
+          <w:bottom w:color="000000" w:space="1" w:sz="6" w:val="single"/>
+        </w:pBdr>
+        <w:tabs>
+          <w:tab w:val="left" w:leader="none" w:pos="900"/>
+        </w:tabs>
+        <w:spacing w:line="240" w:lineRule="auto"/>
+        <w:ind w:left="-720" w:right="-450" w:firstLine="0"/>
+        <w:rPr>
+          <w:rFonts w:ascii="Times New Roman" w:cs="Times New Roman" w:eastAsia="Times New Roman" w:hAnsi="Times New Roman"/>
+          <w:b w:val="1"/>
+          <w:bCs w:val="1"/>
+          <w:sz w:val="24"/>
+          <w:szCs w:val="24"/>
+        </w:rPr>
+      </w:pPr>
+      <w:r>
+        <w:rPr>
+          <w:rFonts w:ascii="Times New Roman" w:cs="Times New Roman" w:eastAsia="Times New Roman" w:hAnsi="Times New Roman"/>
+          <w:b w:val="1"/>
+          <w:bCs w:val="1"/>
+          <w:sz w:val="24"/>
+          <w:szCs w:val="24"/>
+          <w:rtl w:val="0"/>
+        </w:rPr>
+        <w:t xml:space="preserve">EDUCATION</w:t>
+      </w:r>
+      <w:r>
+        <w:rPr>
+          <w:rFonts w:ascii="Times New Roman" w:cs="Times New Roman" w:eastAsia="Times New Roman" w:hAnsi="Times New Roman"/>
+          <w:sz w:val="24"/>
+          <w:szCs w:val="24"/>
+          <w:rtl w:val="0"/>
+        </w:rPr>
+        <w:tab/>
+      </w:r>
+      <w:r>
+        <w:rPr>
+          <w:rFonts w:ascii="Times New Roman" w:cs="Times New Roman" w:eastAsia="Times New Roman" w:hAnsi="Times New Roman"/>
+          <w:b w:val="1"/>
+          <w:bCs w:val="1"/>
+          <w:sz w:val="24"/>
+          <w:szCs w:val="24"/>
+          <w:rtl w:val="0"/>
+        </w:rPr>
+        <w:tab/>
+      </w:r>
+    </w:p>
+    <w:p>
+      <w:pPr>
+        <w:tabs>
+          <w:tab w:val="left" w:leader="none" w:pos="1134"/>
+          <w:tab w:val="right" w:leader="none" w:pos="10503"/>
+        </w:tabs>
+        <w:spacing w:before="23" w:line="240" w:lineRule="auto"/>
+        <w:ind w:left="-720" w:right="-450" w:firstLine="0"/>
+        <w:rPr>
+          <w:rFonts w:ascii="Times New Roman" w:cs="Times New Roman" w:eastAsia="Times New Roman" w:hAnsi="Times New Roman"/>
+          <w:b w:val="1"/>
+          <w:bCs w:val="1"/>
+          <w:sz w:val="24"/>
+          <w:szCs w:val="24"/>
+        </w:rPr>
+      </w:pPr>
+      <w:r>
+        <w:rPr>
+          <w:rFonts w:ascii="Times New Roman" w:cs="Times New Roman" w:eastAsia="Times New Roman" w:hAnsi="Times New Roman"/>
+          <w:b w:val="1"/>
+          <w:bCs w:val="1"/>
+          <w:sz w:val="24"/>
+          <w:szCs w:val="24"/>
+          <w:rtl w:val="0"/>
+        </w:rPr>
+        <w:t xml:space="preserve">M.S. -  Data Science </w:t>
+      </w:r>
+      <w:r>
+        <w:rPr>
+          <w:rFonts w:ascii="Times New Roman" w:cs="Times New Roman" w:eastAsia="Times New Roman" w:hAnsi="Times New Roman"/>
+          <w:sz w:val="24"/>
+          <w:szCs w:val="24"/>
+          <w:rtl w:val="0"/>
+        </w:rPr>
+        <w:t xml:space="preserve">| University of Virginia</w:t>
+      </w:r>
+      <w:r>
+        <w:rPr>
+          <w:rFonts w:ascii="Times New Roman" w:cs="Times New Roman" w:eastAsia="Times New Roman" w:hAnsi="Times New Roman"/>
+          <w:b w:val="1"/>
+          <w:bCs w:val="1"/>
+          <w:sz w:val="24"/>
+          <w:szCs w:val="24"/>
+          <w:rtl w:val="0"/>
+        </w:rPr>
+        <w:tab/>
       </w:r>
     </w:p>
     <w:p>
@@ -657,23 +736,72 @@
           <w:numId w:val="1"/>
         </w:numPr>
         <w:tabs>
-          <w:tab w:val="left" w:leader="none" w:pos="-450"/>
+          <w:tab w:val="left" w:leader="none" w:pos="1134"/>
+          <w:tab w:val="right" w:leader="none" w:pos="10806.000000000002"/>
+        </w:tabs>
+        <w:spacing w:line="240" w:lineRule="auto"/>
+        <w:ind w:left="-270" w:right="-450" w:hanging="360"/>
+        <w:rPr>
+          <w:rFonts w:ascii="Times New Roman" w:cs="Times New Roman" w:eastAsia="Times New Roman" w:hAnsi="Times New Roman"/>
+          <w:i w:val="1"/>
+          <w:iCs w:val="1"/>
+          <w:sz w:val="24"/>
+          <w:szCs w:val="24"/>
+        </w:rPr>
+      </w:pPr>
+      <w:r>
+        <w:rPr>
+          <w:rFonts w:ascii="Times New Roman" w:cs="Times New Roman" w:eastAsia="Times New Roman" w:hAnsi="Times New Roman"/>
+          <w:i w:val="1"/>
+          <w:iCs w:val="1"/>
+          <w:sz w:val="24"/>
+          <w:szCs w:val="24"/>
+          <w:rtl w:val="0"/>
+        </w:rPr>
+        <w:t xml:space="preserve">Focus: Machine learning, Data engineering, Big Data Systems, and Natural Language Processing.</w:t>
+      </w:r>
+    </w:p>
+    <w:p>
+      <w:pPr>
+        <w:tabs>
+          <w:tab w:val="left" w:leader="none" w:pos="1134"/>
           <w:tab w:val="right" w:leader="none" w:pos="10503"/>
         </w:tabs>
         <w:spacing w:line="240" w:lineRule="auto"/>
-        <w:ind w:left="-270" w:right="-450" w:hanging="360"/>
-        <w:rPr>
-          <w:rFonts w:ascii="Source Sans Pro" w:cs="Source Sans Pro" w:eastAsia="Source Sans Pro" w:hAnsi="Source Sans Pro"/>
-        </w:rPr>
-      </w:pPr>
-      <w:r>
-        <w:rPr>
-          <w:rFonts w:ascii="Times New Roman" w:cs="Times New Roman" w:eastAsia="Times New Roman" w:hAnsi="Times New Roman"/>
-          <w:sz w:val="24"/>
-          <w:szCs w:val="24"/>
-          <w:rtl w:val="0"/>
-        </w:rPr>
-        <w:t xml:space="preserve">Identified and resolved N+1 query bottlenecks against large SQL datasets through strategic caching and batching, improving search load times by ~300ms on web and mobile apps.</w:t>
+        <w:ind w:left="-720" w:right="-450" w:firstLine="0"/>
+        <w:rPr>
+          <w:rFonts w:ascii="Times New Roman" w:cs="Times New Roman" w:eastAsia="Times New Roman" w:hAnsi="Times New Roman"/>
+          <w:b w:val="1"/>
+          <w:bCs w:val="1"/>
+          <w:sz w:val="24"/>
+          <w:szCs w:val="24"/>
+        </w:rPr>
+      </w:pPr>
+      <w:r>
+        <w:rPr>
+          <w:rFonts w:ascii="Times New Roman" w:cs="Times New Roman" w:eastAsia="Times New Roman" w:hAnsi="Times New Roman"/>
+          <w:b w:val="1"/>
+          <w:bCs w:val="1"/>
+          <w:sz w:val="24"/>
+          <w:szCs w:val="24"/>
+          <w:rtl w:val="0"/>
+        </w:rPr>
+        <w:t xml:space="preserve">B.A. -  Computer Science </w:t>
+      </w:r>
+      <w:r>
+        <w:rPr>
+          <w:rFonts w:ascii="Times New Roman" w:cs="Times New Roman" w:eastAsia="Times New Roman" w:hAnsi="Times New Roman"/>
+          <w:sz w:val="24"/>
+          <w:szCs w:val="24"/>
+          <w:rtl w:val="0"/>
+        </w:rPr>
+        <w:t xml:space="preserve">| University of Virginia </w:t>
+        <w:tab/>
+      </w:r>
+      <w:r>
+        <w:rPr>
+          <w:rtl w:val="0"/>
+        </w:rPr>
       </w:r>
     </w:p>
     <w:p>
@@ -683,75 +811,67 @@
           <w:numId w:val="1"/>
         </w:numPr>
         <w:tabs>
-          <w:tab w:val="left" w:leader="none" w:pos="-450"/>
-          <w:tab w:val="right" w:leader="none" w:pos="10503"/>
+          <w:tab w:val="left" w:leader="none" w:pos="1134"/>
+          <w:tab w:val="right" w:leader="none" w:pos="10806.000000000002"/>
         </w:tabs>
         <w:spacing w:line="240" w:lineRule="auto"/>
         <w:ind w:left="-270" w:right="-450" w:hanging="360"/>
         <w:rPr>
-          <w:rFonts w:ascii="Times New Roman" w:cs="Times New Roman" w:eastAsia="Times New Roman" w:hAnsi="Times New Roman"/>
-          <w:sz w:val="24"/>
-          <w:szCs w:val="24"/>
-        </w:rPr>
-      </w:pPr>
-      <w:r>
-        <w:rPr>
-          <w:rFonts w:ascii="Times New Roman" w:cs="Times New Roman" w:eastAsia="Times New Roman" w:hAnsi="Times New Roman"/>
-          <w:sz w:val="24"/>
-          <w:szCs w:val="24"/>
-          <w:rtl w:val="0"/>
-        </w:rPr>
-        <w:t xml:space="preserve">Championed code quality by building a comprehensive Jest test suite, reducing manual QA efforts by 2 hours per week for data-critical features.</w:t>
-      </w:r>
-    </w:p>
-    <w:p>
-      <w:pPr>
-        <w:pBdr>
-          <w:bottom w:color="000000" w:space="1" w:sz="6" w:val="single"/>
-        </w:pBdr>
-        <w:tabs>
-          <w:tab w:val="left" w:leader="none" w:pos="900"/>
-        </w:tabs>
-        <w:spacing w:line="240" w:lineRule="auto"/>
-        <w:ind w:left="-720" w:right="-450" w:firstLine="0"/>
-        <w:rPr>
-          <w:rFonts w:ascii="Times New Roman" w:cs="Times New Roman" w:eastAsia="Times New Roman" w:hAnsi="Times New Roman"/>
-          <w:b w:val="1"/>
-          <w:bCs w:val="1"/>
-          <w:sz w:val="24"/>
-          <w:szCs w:val="24"/>
-        </w:rPr>
-      </w:pPr>
-      <w:r>
-        <w:rPr>
-          <w:rFonts w:ascii="Times New Roman" w:cs="Times New Roman" w:eastAsia="Times New Roman" w:hAnsi="Times New Roman"/>
-          <w:b w:val="1"/>
-          <w:bCs w:val="1"/>
-          <w:sz w:val="24"/>
-          <w:szCs w:val="24"/>
-          <w:rtl w:val="0"/>
-        </w:rPr>
-        <w:t xml:space="preserve">EDUCATION</w:t>
-      </w:r>
-      <w:r>
-        <w:rPr>
-          <w:rFonts w:ascii="Times New Roman" w:cs="Times New Roman" w:eastAsia="Times New Roman" w:hAnsi="Times New Roman"/>
-          <w:sz w:val="24"/>
-          <w:szCs w:val="24"/>
-          <w:rtl w:val="0"/>
-        </w:rPr>
-        <w:tab/>
-      </w:r>
-      <w:r>
-        <w:rPr>
-          <w:rFonts w:ascii="Times New Roman" w:cs="Times New Roman" w:eastAsia="Times New Roman" w:hAnsi="Times New Roman"/>
-          <w:b w:val="1"/>
-          <w:bCs w:val="1"/>
-          <w:sz w:val="24"/>
-          <w:szCs w:val="24"/>
-          <w:rtl w:val="0"/>
-        </w:rPr>
-        <w:tab/>
+          <w:rFonts w:ascii="Source Sans Pro" w:cs="Source Sans Pro" w:eastAsia="Source Sans Pro" w:hAnsi="Source Sans Pro"/>
+          <w:sz w:val="24"/>
+          <w:szCs w:val="24"/>
+        </w:rPr>
+      </w:pPr>
+      <w:r>
+        <w:rPr>
+          <w:rFonts w:ascii="Times New Roman" w:cs="Times New Roman" w:eastAsia="Times New Roman" w:hAnsi="Times New Roman"/>
+          <w:i w:val="1"/>
+          <w:iCs w:val="1"/>
+          <w:sz w:val="24"/>
+          <w:szCs w:val="24"/>
+          <w:rtl w:val="0"/>
+        </w:rPr>
+        <w:t xml:space="preserve">Minor:</w:t>
+      </w:r>
+      <w:r>
+        <w:rPr>
+          <w:rFonts w:ascii="Times New Roman" w:cs="Times New Roman" w:eastAsia="Times New Roman" w:hAnsi="Times New Roman"/>
+          <w:sz w:val="24"/>
+          <w:szCs w:val="24"/>
+          <w:rtl w:val="0"/>
+        </w:rPr>
+        <w:t xml:space="preserve"> </w:t>
+      </w:r>
+      <w:r>
+        <w:rPr>
+          <w:rFonts w:ascii="Times New Roman" w:cs="Times New Roman" w:eastAsia="Times New Roman" w:hAnsi="Times New Roman"/>
+          <w:b w:val="1"/>
+          <w:bCs w:val="1"/>
+          <w:sz w:val="24"/>
+          <w:szCs w:val="24"/>
+          <w:rtl w:val="0"/>
+        </w:rPr>
+        <w:t xml:space="preserve">Data Science - </w:t>
+      </w:r>
+      <w:r>
+        <w:rPr>
+          <w:rFonts w:ascii="Times New Roman" w:cs="Times New Roman" w:eastAsia="Times New Roman" w:hAnsi="Times New Roman"/>
+          <w:i w:val="1"/>
+          <w:iCs w:val="1"/>
+          <w:sz w:val="24"/>
+          <w:szCs w:val="24"/>
+          <w:rtl w:val="0"/>
+        </w:rPr>
+        <w:t xml:space="preserve">Relevant Courses: </w:t>
+      </w:r>
+      <w:r>
+        <w:rPr>
+          <w:rFonts w:ascii="Times New Roman" w:cs="Times New Roman" w:eastAsia="Times New Roman" w:hAnsi="Times New Roman"/>
+          <w:sz w:val="24"/>
+          <w:szCs w:val="24"/>
+          <w:rtl w:val="0"/>
+        </w:rPr>
+        <w:t xml:space="preserve"> Artificial Intelligence, Data Science Systems, Database Systems</w:t>
       </w:r>
     </w:p>
     <w:p>
@@ -779,16 +899,16 @@
           <w:szCs w:val="24"/>
           <w:rtl w:val="0"/>
         </w:rPr>
-        <w:t xml:space="preserve">M.S. -  Data Science </w:t>
-      </w:r>
-      <w:r>
-        <w:rPr>
-          <w:rFonts w:ascii="Times New Roman" w:cs="Times New Roman" w:eastAsia="Times New Roman" w:hAnsi="Times New Roman"/>
-          <w:sz w:val="24"/>
-          <w:szCs w:val="24"/>
-          <w:rtl w:val="0"/>
-        </w:rPr>
-        <w:t xml:space="preserve">| University of Virginia</w:t>
+        <w:t xml:space="preserve">Software Engineering Bootcamp | </w:t>
+      </w:r>
+      <w:r>
+        <w:rPr>
+          <w:rFonts w:ascii="Times New Roman" w:cs="Times New Roman" w:eastAsia="Times New Roman" w:hAnsi="Times New Roman"/>
+          <w:sz w:val="24"/>
+          <w:szCs w:val="24"/>
+          <w:rtl w:val="0"/>
+        </w:rPr>
+        <w:t xml:space="preserve">Codesmith, Full-time Immersive</w:t>
       </w:r>
       <w:r>
         <w:rPr>
@@ -823,25 +943,57 @@
       <w:r>
         <w:rPr>
           <w:rFonts w:ascii="Times New Roman" w:cs="Times New Roman" w:eastAsia="Times New Roman" w:hAnsi="Times New Roman"/>
-          <w:sz w:val="24"/>
-          <w:szCs w:val="24"/>
-          <w:rtl w:val="0"/>
-        </w:rPr>
-        <w:t xml:space="preserve">Focus: Machine learning, Data engineering, Big Data Systems, and Natural Language Processing.</w:t>
-      </w:r>
-      <w:r>
-        <w:rPr>
-          <w:rtl w:val="0"/>
-        </w:rPr>
+          <w:i w:val="1"/>
+          <w:iCs w:val="1"/>
+          <w:sz w:val="24"/>
+          <w:szCs w:val="24"/>
+          <w:rtl w:val="0"/>
+        </w:rPr>
+        <w:t xml:space="preserve">Focus: Advanced JavaScript, TypeScript, Database Design, State Management, React + Redux Toolkit</w:t>
+      </w:r>
+      <w:r>
+        <w:rPr>
+          <w:rtl w:val="0"/>
+        </w:rPr>
+      </w:r>
+    </w:p>
+    <w:p>
+      <w:pPr>
+        <w:pBdr>
+          <w:bottom w:color="000000" w:space="1" w:sz="6" w:val="single"/>
+        </w:pBdr>
+        <w:tabs>
+          <w:tab w:val="left" w:leader="none" w:pos="900"/>
+        </w:tabs>
+        <w:spacing w:line="240" w:lineRule="auto"/>
+        <w:ind w:left="-720" w:right="-450" w:firstLine="0"/>
+        <w:rPr>
+          <w:rFonts w:ascii="Times New Roman" w:cs="Times New Roman" w:eastAsia="Times New Roman" w:hAnsi="Times New Roman"/>
+          <w:b w:val="1"/>
+          <w:bCs w:val="1"/>
+          <w:sz w:val="24"/>
+          <w:szCs w:val="24"/>
+        </w:rPr>
+      </w:pPr>
+      <w:r>
+        <w:rPr>
+          <w:rFonts w:ascii="Times New Roman" w:cs="Times New Roman" w:eastAsia="Times New Roman" w:hAnsi="Times New Roman"/>
+          <w:b w:val="1"/>
+          <w:bCs w:val="1"/>
+          <w:sz w:val="24"/>
+          <w:szCs w:val="24"/>
+          <w:rtl w:val="0"/>
+        </w:rPr>
+        <w:t xml:space="preserve">PROJECTS</w:t>
       </w:r>
     </w:p>
     <w:p>
       <w:pPr>
         <w:tabs>
           <w:tab w:val="left" w:leader="none" w:pos="1134"/>
-          <w:tab w:val="right" w:leader="none" w:pos="10503"/>
-        </w:tabs>
-        <w:spacing w:line="240" w:lineRule="auto"/>
+          <w:tab w:val="right" w:leader="none" w:pos="10806.000000000002"/>
+        </w:tabs>
+        <w:spacing w:before="23" w:line="240" w:lineRule="auto"/>
         <w:ind w:left="-720" w:right="-450" w:firstLine="0"/>
         <w:rPr>
           <w:rFonts w:ascii="Times New Roman" w:cs="Times New Roman" w:eastAsia="Times New Roman" w:hAnsi="Times New Roman"/>
@@ -860,16 +1012,90 @@
           <w:szCs w:val="24"/>
           <w:rtl w:val="0"/>
         </w:rPr>
-        <w:t xml:space="preserve">B.A. -  Computer Science </w:t>
-      </w:r>
-      <w:r>
-        <w:rPr>
-          <w:rFonts w:ascii="Times New Roman" w:cs="Times New Roman" w:eastAsia="Times New Roman" w:hAnsi="Times New Roman"/>
-          <w:sz w:val="24"/>
-          <w:szCs w:val="24"/>
-          <w:rtl w:val="0"/>
-        </w:rPr>
-        <w:t xml:space="preserve">| University of Virginia </w:t>
+        <w:t xml:space="preserve">OS-Labs: KafkaNightOwl | Full-Stack Software Engineer</w:t>
+        <w:tab/>
+      </w:r>
+    </w:p>
+    <w:p>
+      <w:pPr>
+        <w:numPr>
+          <w:ilvl w:val="0"/>
+          <w:numId w:val="3"/>
+        </w:numPr>
+        <w:tabs>
+          <w:tab w:val="left" w:leader="none" w:pos="1134"/>
+          <w:tab w:val="right" w:leader="none" w:pos="10806.000000000002"/>
+        </w:tabs>
+        <w:spacing w:line="240" w:lineRule="auto"/>
+        <w:ind w:left="-270" w:right="-450" w:hanging="360"/>
+        <w:rPr>
+          <w:rFonts w:ascii="Times New Roman" w:cs="Times New Roman" w:eastAsia="Times New Roman" w:hAnsi="Times New Roman"/>
+          <w:sz w:val="24"/>
+          <w:szCs w:val="24"/>
+        </w:rPr>
+      </w:pPr>
+      <w:r>
+        <w:rPr>
+          <w:rFonts w:ascii="Times New Roman" w:cs="Times New Roman" w:eastAsia="Times New Roman" w:hAnsi="Times New Roman"/>
+          <w:sz w:val="24"/>
+          <w:szCs w:val="24"/>
+          <w:rtl w:val="0"/>
+        </w:rPr>
+        <w:t xml:space="preserve">Streamlined Kafka message transactions by building a Message Data &amp; Metrics Service with Node.js/ Express.</w:t>
+      </w:r>
+    </w:p>
+    <w:p>
+      <w:pPr>
+        <w:numPr>
+          <w:ilvl w:val="0"/>
+          <w:numId w:val="3"/>
+        </w:numPr>
+        <w:tabs>
+          <w:tab w:val="left" w:leader="none" w:pos="1134"/>
+          <w:tab w:val="right" w:leader="none" w:pos="10806.000000000002"/>
+        </w:tabs>
+        <w:spacing w:line="240" w:lineRule="auto"/>
+        <w:ind w:left="-270" w:right="-450" w:hanging="360"/>
+        <w:rPr>
+          <w:rFonts w:ascii="Times New Roman" w:cs="Times New Roman" w:eastAsia="Times New Roman" w:hAnsi="Times New Roman"/>
+          <w:sz w:val="24"/>
+          <w:szCs w:val="24"/>
+        </w:rPr>
+      </w:pPr>
+      <w:r>
+        <w:rPr>
+          <w:rFonts w:ascii="Times New Roman" w:cs="Times New Roman" w:eastAsia="Times New Roman" w:hAnsi="Times New Roman"/>
+          <w:sz w:val="24"/>
+          <w:szCs w:val="24"/>
+          <w:rtl w:val="0"/>
+        </w:rPr>
+        <w:t xml:space="preserve">Built a maintainable web dashboard for Kafka message metrics by developing a React/TypeScript interface using Flux architecture and container patterns.</w:t>
+      </w:r>
+    </w:p>
+    <w:p>
+      <w:pPr>
+        <w:tabs>
+          <w:tab w:val="left" w:leader="none" w:pos="1134"/>
+          <w:tab w:val="right" w:leader="none" w:pos="10806.000000000002"/>
+        </w:tabs>
+        <w:spacing w:line="240" w:lineRule="auto"/>
+        <w:ind w:left="-720" w:right="-450" w:firstLine="0"/>
+        <w:rPr>
+          <w:rFonts w:ascii="Times New Roman" w:cs="Times New Roman" w:eastAsia="Times New Roman" w:hAnsi="Times New Roman"/>
+          <w:sz w:val="24"/>
+          <w:szCs w:val="24"/>
+        </w:rPr>
+      </w:pPr>
+      <w:r>
+        <w:rPr>
+          <w:rFonts w:ascii="Times New Roman" w:cs="Times New Roman" w:eastAsia="Times New Roman" w:hAnsi="Times New Roman"/>
+          <w:b w:val="1"/>
+          <w:bCs w:val="1"/>
+          <w:sz w:val="24"/>
+          <w:szCs w:val="24"/>
+          <w:rtl w:val="0"/>
+        </w:rPr>
+        <w:t xml:space="preserve">Acne-AI | Full-Stack Software Engineer</w:t>
         <w:tab/>
       </w:r>
       <w:r>
@@ -891,109 +1117,19 @@
         <w:spacing w:line="240" w:lineRule="auto"/>
         <w:ind w:left="-270" w:right="-450" w:hanging="360"/>
         <w:rPr>
-          <w:rFonts w:ascii="Source Sans Pro" w:cs="Source Sans Pro" w:eastAsia="Source Sans Pro" w:hAnsi="Source Sans Pro"/>
-          <w:sz w:val="24"/>
-          <w:szCs w:val="24"/>
-        </w:rPr>
-      </w:pPr>
-      <w:r>
-        <w:rPr>
-          <w:rFonts w:ascii="Times New Roman" w:cs="Times New Roman" w:eastAsia="Times New Roman" w:hAnsi="Times New Roman"/>
-          <w:i w:val="1"/>
-          <w:iCs w:val="1"/>
-          <w:sz w:val="24"/>
-          <w:szCs w:val="24"/>
-          <w:rtl w:val="0"/>
-        </w:rPr>
-        <w:t xml:space="preserve">Minor:</w:t>
-      </w:r>
-      <w:r>
-        <w:rPr>
-          <w:rFonts w:ascii="Times New Roman" w:cs="Times New Roman" w:eastAsia="Times New Roman" w:hAnsi="Times New Roman"/>
-          <w:sz w:val="24"/>
-          <w:szCs w:val="24"/>
-          <w:rtl w:val="0"/>
-        </w:rPr>
-        <w:t xml:space="preserve"> </w:t>
-      </w:r>
-      <w:r>
-        <w:rPr>
-          <w:rFonts w:ascii="Times New Roman" w:cs="Times New Roman" w:eastAsia="Times New Roman" w:hAnsi="Times New Roman"/>
-          <w:b w:val="1"/>
-          <w:bCs w:val="1"/>
-          <w:sz w:val="24"/>
-          <w:szCs w:val="24"/>
-          <w:rtl w:val="0"/>
-        </w:rPr>
-        <w:t xml:space="preserve">Data Science - </w:t>
-      </w:r>
-      <w:r>
-        <w:rPr>
-          <w:rFonts w:ascii="Times New Roman" w:cs="Times New Roman" w:eastAsia="Times New Roman" w:hAnsi="Times New Roman"/>
-          <w:i w:val="1"/>
-          <w:iCs w:val="1"/>
-          <w:sz w:val="24"/>
-          <w:szCs w:val="24"/>
-          <w:rtl w:val="0"/>
-        </w:rPr>
-        <w:t xml:space="preserve">Relevant Courses: </w:t>
-      </w:r>
-      <w:r>
-        <w:rPr>
-          <w:rFonts w:ascii="Times New Roman" w:cs="Times New Roman" w:eastAsia="Times New Roman" w:hAnsi="Times New Roman"/>
-          <w:sz w:val="24"/>
-          <w:szCs w:val="24"/>
-          <w:rtl w:val="0"/>
-        </w:rPr>
-        <w:t xml:space="preserve"> Artificial Intelligence, Data Science Systems, Database Systems</w:t>
-      </w:r>
-    </w:p>
-    <w:p>
-      <w:pPr>
-        <w:tabs>
-          <w:tab w:val="left" w:leader="none" w:pos="1134"/>
-          <w:tab w:val="right" w:leader="none" w:pos="10503"/>
-        </w:tabs>
-        <w:spacing w:before="23" w:line="240" w:lineRule="auto"/>
-        <w:ind w:left="-720" w:right="-450" w:firstLine="0"/>
-        <w:rPr>
-          <w:rFonts w:ascii="Times New Roman" w:cs="Times New Roman" w:eastAsia="Times New Roman" w:hAnsi="Times New Roman"/>
-          <w:b w:val="1"/>
-          <w:bCs w:val="1"/>
-          <w:sz w:val="24"/>
-          <w:szCs w:val="24"/>
-        </w:rPr>
-      </w:pPr>
-      <w:r>
-        <w:rPr>
-          <w:rFonts w:ascii="Times New Roman" w:cs="Times New Roman" w:eastAsia="Times New Roman" w:hAnsi="Times New Roman"/>
-          <w:b w:val="1"/>
-          <w:bCs w:val="1"/>
-          <w:sz w:val="24"/>
-          <w:szCs w:val="24"/>
-          <w:rtl w:val="0"/>
-        </w:rPr>
-        <w:t xml:space="preserve">Software Engineering Bootcamp | </w:t>
-      </w:r>
-      <w:r>
-        <w:rPr>
-          <w:rFonts w:ascii="Times New Roman" w:cs="Times New Roman" w:eastAsia="Times New Roman" w:hAnsi="Times New Roman"/>
-          <w:sz w:val="24"/>
-          <w:szCs w:val="24"/>
-          <w:rtl w:val="0"/>
-        </w:rPr>
-        <w:t xml:space="preserve">Codesmith, Full-time Immersive</w:t>
-      </w:r>
-      <w:r>
-        <w:rPr>
-          <w:rFonts w:ascii="Times New Roman" w:cs="Times New Roman" w:eastAsia="Times New Roman" w:hAnsi="Times New Roman"/>
-          <w:b w:val="1"/>
-          <w:bCs w:val="1"/>
-          <w:sz w:val="24"/>
-          <w:szCs w:val="24"/>
-          <w:rtl w:val="0"/>
-        </w:rPr>
-        <w:tab/>
+          <w:rFonts w:ascii="Times New Roman" w:cs="Times New Roman" w:eastAsia="Times New Roman" w:hAnsi="Times New Roman"/>
+          <w:sz w:val="24"/>
+          <w:szCs w:val="24"/>
+        </w:rPr>
+      </w:pPr>
+      <w:r>
+        <w:rPr>
+          <w:rFonts w:ascii="Times New Roman" w:cs="Times New Roman" w:eastAsia="Times New Roman" w:hAnsi="Times New Roman"/>
+          <w:sz w:val="24"/>
+          <w:szCs w:val="24"/>
+          <w:rtl w:val="0"/>
+        </w:rPr>
+        <w:t xml:space="preserve">Achieved strong benchmark performance on a held-out test set by fine-tuning Meta's DINOv2 foundation model for skin condition classification using Python and Google Colab A100 GPUs.</w:t>
       </w:r>
     </w:p>
     <w:p>
@@ -1017,221 +1153,11 @@
       <w:r>
         <w:rPr>
           <w:rFonts w:ascii="Times New Roman" w:cs="Times New Roman" w:eastAsia="Times New Roman" w:hAnsi="Times New Roman"/>
-          <w:i w:val="1"/>
-          <w:iCs w:val="1"/>
-          <w:sz w:val="24"/>
-          <w:szCs w:val="24"/>
-          <w:rtl w:val="0"/>
-        </w:rPr>
-        <w:t xml:space="preserve">Focus: Advanced JavaScript, TypeScript, Database Design, State Management, React + Redux Toolkit</w:t>
-      </w:r>
-      <w:r>
-        <w:rPr>
-          <w:rtl w:val="0"/>
-        </w:rPr>
-      </w:r>
-    </w:p>
-    <w:p>
-      <w:pPr>
-        <w:pBdr>
-          <w:bottom w:color="000000" w:space="1" w:sz="6" w:val="single"/>
-        </w:pBdr>
-        <w:tabs>
-          <w:tab w:val="left" w:leader="none" w:pos="900"/>
-        </w:tabs>
-        <w:spacing w:line="240" w:lineRule="auto"/>
-        <w:ind w:left="-720" w:right="-450" w:firstLine="0"/>
-        <w:rPr>
-          <w:rFonts w:ascii="Times New Roman" w:cs="Times New Roman" w:eastAsia="Times New Roman" w:hAnsi="Times New Roman"/>
-          <w:b w:val="1"/>
-          <w:bCs w:val="1"/>
-          <w:sz w:val="24"/>
-          <w:szCs w:val="24"/>
-        </w:rPr>
-      </w:pPr>
-      <w:r>
-        <w:rPr>
-          <w:rFonts w:ascii="Times New Roman" w:cs="Times New Roman" w:eastAsia="Times New Roman" w:hAnsi="Times New Roman"/>
-          <w:b w:val="1"/>
-          <w:bCs w:val="1"/>
-          <w:sz w:val="24"/>
-          <w:szCs w:val="24"/>
-          <w:rtl w:val="0"/>
-        </w:rPr>
-        <w:t xml:space="preserve">PROJECTS</w:t>
-      </w:r>
-    </w:p>
-    <w:p>
-      <w:pPr>
-        <w:tabs>
-          <w:tab w:val="left" w:leader="none" w:pos="1134"/>
-          <w:tab w:val="right" w:leader="none" w:pos="10806.000000000002"/>
-        </w:tabs>
-        <w:spacing w:before="23" w:line="240" w:lineRule="auto"/>
-        <w:ind w:left="-720" w:right="-450" w:firstLine="0"/>
-        <w:rPr>
-          <w:rFonts w:ascii="Times New Roman" w:cs="Times New Roman" w:eastAsia="Times New Roman" w:hAnsi="Times New Roman"/>
-          <w:b w:val="1"/>
-          <w:bCs w:val="1"/>
-          <w:sz w:val="24"/>
-          <w:szCs w:val="24"/>
-        </w:rPr>
-      </w:pPr>
-      <w:r>
-        <w:rPr>
-          <w:rFonts w:ascii="Times New Roman" w:cs="Times New Roman" w:eastAsia="Times New Roman" w:hAnsi="Times New Roman"/>
-          <w:b w:val="1"/>
-          <w:bCs w:val="1"/>
-          <w:sz w:val="24"/>
-          <w:szCs w:val="24"/>
-          <w:rtl w:val="0"/>
-        </w:rPr>
-        <w:t xml:space="preserve">OS-Labs: KafkaNightOwl | Full-Stack Software Engineer</w:t>
-        <w:tab/>
-      </w:r>
-    </w:p>
-    <w:p>
-      <w:pPr>
-        <w:numPr>
-          <w:ilvl w:val="0"/>
-          <w:numId w:val="3"/>
-        </w:numPr>
-        <w:tabs>
-          <w:tab w:val="left" w:leader="none" w:pos="1134"/>
-          <w:tab w:val="right" w:leader="none" w:pos="10806.000000000002"/>
-        </w:tabs>
-        <w:spacing w:line="240" w:lineRule="auto"/>
-        <w:ind w:left="-270" w:right="-450" w:hanging="360"/>
-        <w:rPr>
-          <w:rFonts w:ascii="Times New Roman" w:cs="Times New Roman" w:eastAsia="Times New Roman" w:hAnsi="Times New Roman"/>
-          <w:sz w:val="24"/>
-          <w:szCs w:val="24"/>
-        </w:rPr>
-      </w:pPr>
-      <w:r>
-        <w:rPr>
-          <w:rFonts w:ascii="Times New Roman" w:cs="Times New Roman" w:eastAsia="Times New Roman" w:hAnsi="Times New Roman"/>
-          <w:sz w:val="24"/>
-          <w:szCs w:val="24"/>
-          <w:rtl w:val="0"/>
-        </w:rPr>
-        <w:t xml:space="preserve">Built a Message Data &amp; Metrics Service using Node.js/Express, streamlining Kafka message transactions </w:t>
-      </w:r>
-    </w:p>
-    <w:p>
-      <w:pPr>
-        <w:numPr>
-          <w:ilvl w:val="0"/>
-          <w:numId w:val="3"/>
-        </w:numPr>
-        <w:tabs>
-          <w:tab w:val="left" w:leader="none" w:pos="1134"/>
-          <w:tab w:val="right" w:leader="none" w:pos="10806.000000000002"/>
-        </w:tabs>
-        <w:spacing w:line="240" w:lineRule="auto"/>
-        <w:ind w:left="-270" w:right="-450" w:hanging="360"/>
-        <w:rPr>
-          <w:rFonts w:ascii="Times New Roman" w:cs="Times New Roman" w:eastAsia="Times New Roman" w:hAnsi="Times New Roman"/>
-          <w:sz w:val="24"/>
-          <w:szCs w:val="24"/>
-        </w:rPr>
-      </w:pPr>
-      <w:r>
-        <w:rPr>
-          <w:rFonts w:ascii="Times New Roman" w:cs="Times New Roman" w:eastAsia="Times New Roman" w:hAnsi="Times New Roman"/>
-          <w:sz w:val="24"/>
-          <w:szCs w:val="24"/>
-          <w:rtl w:val="0"/>
-        </w:rPr>
-        <w:t xml:space="preserve">Designed a scalable React/TypeScript dashboard with Flux architecture, applying container patterns for maintainable UI state management.</w:t>
-      </w:r>
-    </w:p>
-    <w:p>
-      <w:pPr>
-        <w:tabs>
-          <w:tab w:val="left" w:leader="none" w:pos="1134"/>
-          <w:tab w:val="right" w:leader="none" w:pos="10806.000000000002"/>
-        </w:tabs>
-        <w:spacing w:line="240" w:lineRule="auto"/>
-        <w:ind w:left="-720" w:right="-450" w:firstLine="0"/>
-        <w:rPr>
-          <w:rFonts w:ascii="Times New Roman" w:cs="Times New Roman" w:eastAsia="Times New Roman" w:hAnsi="Times New Roman"/>
-          <w:sz w:val="24"/>
-          <w:szCs w:val="24"/>
-        </w:rPr>
-      </w:pPr>
-      <w:r>
-        <w:rPr>
-          <w:rFonts w:ascii="Times New Roman" w:cs="Times New Roman" w:eastAsia="Times New Roman" w:hAnsi="Times New Roman"/>
-          <w:b w:val="1"/>
-          <w:bCs w:val="1"/>
-          <w:sz w:val="24"/>
-          <w:szCs w:val="24"/>
-          <w:rtl w:val="0"/>
-        </w:rPr>
-        <w:t xml:space="preserve">Acne-AI | Full-Stack Software Engineer</w:t>
-        <w:tab/>
-      </w:r>
-      <w:r>
-        <w:rPr>
-          <w:rtl w:val="0"/>
-        </w:rPr>
-      </w:r>
-    </w:p>
-    <w:p>
-      <w:pPr>
-        <w:numPr>
-          <w:ilvl w:val="0"/>
-          <w:numId w:val="1"/>
-        </w:numPr>
-        <w:tabs>
-          <w:tab w:val="left" w:leader="none" w:pos="1134"/>
-          <w:tab w:val="right" w:leader="none" w:pos="10806.000000000002"/>
-        </w:tabs>
-        <w:spacing w:line="240" w:lineRule="auto"/>
-        <w:ind w:left="-270" w:right="-450" w:hanging="360"/>
-        <w:rPr>
-          <w:rFonts w:ascii="Times New Roman" w:cs="Times New Roman" w:eastAsia="Times New Roman" w:hAnsi="Times New Roman"/>
-          <w:sz w:val="24"/>
-          <w:szCs w:val="24"/>
-        </w:rPr>
-      </w:pPr>
-      <w:r>
-        <w:rPr>
-          <w:rFonts w:ascii="Times New Roman" w:cs="Times New Roman" w:eastAsia="Times New Roman" w:hAnsi="Times New Roman"/>
-          <w:sz w:val="24"/>
-          <w:szCs w:val="24"/>
-          <w:rtl w:val="0"/>
-        </w:rPr>
-        <w:t xml:space="preserve">Fine-tuned Meta's DinoV2 foundation model for skin condition classification, achieving strong benchmark performance on a held-out test set using Google Colab's A100 GPUs.</w:t>
-      </w:r>
-    </w:p>
-    <w:p>
-      <w:pPr>
-        <w:numPr>
-          <w:ilvl w:val="0"/>
-          <w:numId w:val="1"/>
-        </w:numPr>
-        <w:tabs>
-          <w:tab w:val="left" w:leader="none" w:pos="1134"/>
-          <w:tab w:val="right" w:leader="none" w:pos="10806.000000000002"/>
-        </w:tabs>
-        <w:spacing w:line="240" w:lineRule="auto"/>
-        <w:ind w:left="-270" w:right="-450" w:hanging="360"/>
-        <w:rPr>
-          <w:rFonts w:ascii="Times New Roman" w:cs="Times New Roman" w:eastAsia="Times New Roman" w:hAnsi="Times New Roman"/>
-          <w:sz w:val="24"/>
-          <w:szCs w:val="24"/>
-        </w:rPr>
-      </w:pPr>
-      <w:r>
-        <w:rPr>
-          <w:rFonts w:ascii="Times New Roman" w:cs="Times New Roman" w:eastAsia="Times New Roman" w:hAnsi="Times New Roman"/>
-          <w:sz w:val="24"/>
-          <w:szCs w:val="24"/>
-          <w:rtl w:val="0"/>
-        </w:rPr>
-        <w:t xml:space="preserve">Integrated a React frontend with the Python model backend using Axios, optimizing image processing and reducing diagnosis latency.</w:t>
+          <w:sz w:val="24"/>
+          <w:szCs w:val="24"/>
+          <w:rtl w:val="0"/>
+        </w:rPr>
+        <w:t xml:space="preserve">Reduced diagnosis latency by integrating a React frontend with a Python model backend using Axios and optimizing image processing.</w:t>
       </w:r>
     </w:p>
     <w:p>
@@ -1330,36 +1256,17 @@
           <w:sz w:val="24"/>
           <w:szCs w:val="24"/>
         </w:rPr>
-        <w:sectPr>
-          <w:type w:val="continuous"/>
-          <w:pgSz w:h="15840" w:w="12240" w:orient="portrait"/>
-          <w:pgMar w:bottom="1260" w:top="900" w:left="1440" w:right="1170" w:header="720" w:footer="720"/>
-        </w:sectPr>
-      </w:pPr>
-      <w:r>
-        <w:rPr>
-          <w:rFonts w:ascii="Times New Roman" w:cs="Times New Roman" w:eastAsia="Times New Roman" w:hAnsi="Times New Roman"/>
-          <w:sz w:val="24"/>
-          <w:szCs w:val="24"/>
-          <w:rtl w:val="0"/>
-        </w:rPr>
-        <w:t xml:space="preserve">Presented solutions to GraphQL’s N+1 query issue. Talk sponsored by Codesmith, Jeeny, and Bractlet.</w:t>
-      </w:r>
-    </w:p>
-    <w:p>
-      <w:pPr>
-        <w:tabs>
-          <w:tab w:val="left" w:leader="none" w:pos="1134"/>
-          <w:tab w:val="right" w:leader="none" w:pos="10800"/>
-        </w:tabs>
-        <w:spacing w:line="240" w:lineRule="auto"/>
-        <w:ind w:left="0" w:right="-450" w:firstLine="0"/>
-        <w:rPr>
-          <w:rFonts w:ascii="Times New Roman" w:cs="Times New Roman" w:eastAsia="Times New Roman" w:hAnsi="Times New Roman"/>
-          <w:sz w:val="2"/>
-          <w:szCs w:val="2"/>
-        </w:rPr>
-      </w:pPr>
+      </w:pPr>
+      <w:r>
+        <w:rPr>
+          <w:rFonts w:ascii="Times New Roman" w:cs="Times New Roman" w:eastAsia="Times New Roman" w:hAnsi="Times New Roman"/>
+          <w:sz w:val="24"/>
+          <w:szCs w:val="24"/>
+          <w:rtl w:val="0"/>
+        </w:rPr>
+        <w:t xml:space="preserve">Presented solutions to GraphQL’s N+1 query issue. Talk sponsored by Codesmith, Jeeny, and Bractlet. </w:t>
+        <w:tab/>
+      </w:r>
       <w:r>
         <w:rPr>
           <w:rtl w:val="0"/>
@@ -1369,7 +1276,7 @@
     <w:sectPr>
       <w:type w:val="continuous"/>
       <w:pgSz w:h="15840" w:w="12240" w:orient="portrait"/>
-      <w:pgMar w:bottom="720" w:top="270" w:left="720" w:right="720" w:header="1440" w:footer="1440"/>
+      <w:pgMar w:bottom="1260" w:top="1170" w:left="1440" w:right="1170" w:header="720" w:footer="720"/>
     </w:sectPr>
   </w:body>
 </w:document>

</xml_diff>